<commit_message>
Rebuild Balloon Pop camera graphic on the locked template + proper reflection docs
Camera settings now use the shared LOCKED template (Shutter[CHANGE THIS] /
Aperture / ISO / Light Meter / Image Quality); only the three values change
(1/1600, F8.0, ISO 800, JPG). Parameterized capture_panel and
camera_settings_section (values + change_field + activity) with defaults that
leave the other modules byte-identical, so the next module can move CHANGE THIS
to the f-stop with the same formatting. Manual mode + High-Speed Continuous +
the drive-button how-to moved into their own separate section, out of the
locked graphic.

Reflection docs: replaced the placeholders with the canonical text-box template
(build-reflection.js), separate EN + ES per course.

Co-Authored-By: Claude Opus 4.8 <noreply@anthropic.com>
</commit_message>
<xml_diff>
--- a/assets/course-documents/Balloon-Pop-Reflection-EN.docx
+++ b/assets/course-documents/Balloon-Pop-Reflection-EN.docx
@@ -4,9 +4,57 @@
   <w:body>
     <w:p>
       <w:pPr>
-        <w:spacing w:after="60"/>
+        <w:spacing w:after="20" w:before="160"/>
         <w:jc w:val="center"/>
       </w:pPr>
+      <w:r>
+        <w:drawing>
+          <wp:anchor distT="0" distB="0" distL="0" distR="0" simplePos="0" allowOverlap="1" behindDoc="1" locked="0" layoutInCell="1" relativeHeight="914400">
+            <wp:simplePos x="0" y="0"/>
+            <wp:positionH relativeFrom="page">
+              <wp:posOffset>460000</wp:posOffset>
+            </wp:positionH>
+            <wp:positionV relativeFrom="page">
+              <wp:posOffset>430000</wp:posOffset>
+            </wp:positionV>
+            <wp:extent cx="914400" cy="914400"/>
+            <wp:effectExtent t="0" r="0" b="0" l="0"/>
+            <wp:wrapNone/>
+            <wp:docPr id="1" name="PVHS" descr="Pioneer Valley High School" title="PVHS"/>
+            <wp:cNvGraphicFramePr>
+              <a:graphicFrameLocks xmlns:a="http://schemas.openxmlformats.org/drawingml/2006/main" noChangeAspect="1"/>
+            </wp:cNvGraphicFramePr>
+            <a:graphic xmlns:a="http://schemas.openxmlformats.org/drawingml/2006/main">
+              <a:graphicData uri="http://schemas.openxmlformats.org/drawingml/2006/picture">
+                <pic:pic xmlns:pic="http://schemas.openxmlformats.org/drawingml/2006/picture">
+                  <pic:nvPicPr>
+                    <pic:cNvPr id="0" name="" descr=""/>
+                    <pic:cNvPicPr>
+                      <a:picLocks noChangeAspect="1" noChangeArrowheads="1"/>
+                    </pic:cNvPicPr>
+                  </pic:nvPicPr>
+                  <pic:blipFill>
+                    <a:blip r:embed="rId7" cstate="none"/>
+                    <a:srcRect/>
+                    <a:stretch>
+                      <a:fillRect/>
+                    </a:stretch>
+                  </pic:blipFill>
+                  <pic:spPr bwMode="auto">
+                    <a:xfrm>
+                      <a:off x="0" y="0"/>
+                      <a:ext cx="914400" cy="914400"/>
+                    </a:xfrm>
+                    <a:prstGeom prst="rect">
+                      <a:avLst/>
+                    </a:prstGeom>
+                  </pic:spPr>
+                </pic:pic>
+              </a:graphicData>
+            </a:graphic>
+          </wp:anchor>
+        </w:drawing>
+      </w:r>
       <w:r>
         <w:rPr>
           <w:rFonts w:ascii="Arial" w:cs="Arial" w:eastAsia="Arial" w:hAnsi="Arial"/>
@@ -16,7 +64,7 @@
           <w:sz w:val="40"/>
           <w:szCs w:val="40"/>
         </w:rPr>
-        <w:t xml:space="preserve">Balloon Pop Reflection</w:t>
+        <w:t xml:space="preserve">Balloon Pop: Reflection</w:t>
       </w:r>
     </w:p>
     <w:p>
@@ -31,23 +79,72 @@
           <w:sz w:val="20"/>
           <w:szCs w:val="20"/>
         </w:rPr>
-        <w:t xml:space="preserve">Photography · Pioneer Valley High School · Mr. Silva</w:t>
+        <w:t xml:space="preserve">Photography 1A · Pioneer Valley High School · Mr. Silva</w:t>
       </w:r>
     </w:p>
     <w:p>
       <w:pPr>
         <w:pBdr>
-          <w:bottom w:val="single" w:color="007474" w:sz="12" w:space="1"/>
+          <w:bottom w:val="single" w:color="007474" w:sz="18" w:space="2"/>
         </w:pBdr>
         <w:spacing w:after="160"/>
       </w:pPr>
       <w:r>
+        <w:rPr>
+          <w:sz w:val="2"/>
+          <w:szCs w:val="2"/>
+        </w:rPr>
         <w:t xml:space="preserve"/>
       </w:r>
     </w:p>
     <w:p>
       <w:pPr>
-        <w:spacing w:after="200"/>
+        <w:pBdr>
+          <w:bottom w:val="single" w:color="C4C4C4" w:sz="6" w:space="6"/>
+        </w:pBdr>
+        <w:tabs>
+          <w:tab w:val="left" w:pos="4200"/>
+          <w:tab w:val="left" w:pos="8000"/>
+        </w:tabs>
+        <w:spacing w:after="40"/>
+      </w:pPr>
+      <w:r>
+        <w:rPr>
+          <w:rFonts w:ascii="Arial" w:cs="Arial" w:eastAsia="Arial" w:hAnsi="Arial"/>
+          <w:b/>
+          <w:bCs/>
+          <w:color w:val="007474"/>
+          <w:sz w:val="22"/>
+          <w:szCs w:val="22"/>
+        </w:rPr>
+        <w:t xml:space="preserve">Name:</w:t>
+      </w:r>
+      <w:r>
+        <w:rPr>
+          <w:rFonts w:ascii="Arial" w:cs="Arial" w:eastAsia="Arial" w:hAnsi="Arial"/>
+          <w:b/>
+          <w:bCs/>
+          <w:color w:val="007474"/>
+          <w:sz w:val="22"/>
+          <w:szCs w:val="22"/>
+        </w:rPr>
+        <w:t xml:space="preserve">	Period:</w:t>
+      </w:r>
+      <w:r>
+        <w:rPr>
+          <w:rFonts w:ascii="Arial" w:cs="Arial" w:eastAsia="Arial" w:hAnsi="Arial"/>
+          <w:b/>
+          <w:bCs/>
+          <w:color w:val="007474"/>
+          <w:sz w:val="22"/>
+          <w:szCs w:val="22"/>
+        </w:rPr>
+        <w:t xml:space="preserve">	Date:</w:t>
+      </w:r>
+    </w:p>
+    <w:p>
+      <w:pPr>
+        <w:spacing w:after="120" w:before="100"/>
       </w:pPr>
       <w:r>
         <w:rPr>
@@ -58,140 +155,492 @@
           <w:sz w:val="22"/>
           <w:szCs w:val="22"/>
         </w:rPr>
-        <w:t xml:space="preserve">PLACEHOLDER: Mr. Silva will post the final reflection document. Draft questions are below.</w:t>
-      </w:r>
-    </w:p>
-    <w:p>
-      <w:pPr>
-        <w:spacing w:after="80" w:before="120"/>
-      </w:pPr>
-      <w:r>
-        <w:rPr>
-          <w:rFonts w:ascii="Arial" w:cs="Arial" w:eastAsia="Arial" w:hAnsi="Arial"/>
-          <w:b/>
-          <w:bCs/>
-          <w:color w:val="007474"/>
-          <w:sz w:val="24"/>
-          <w:szCs w:val="24"/>
-        </w:rPr>
-        <w:t xml:space="preserve">1. What worked well during the balloon pop?</w:t>
-      </w:r>
-    </w:p>
-    <w:p>
-      <w:pPr>
-        <w:spacing w:after="200"/>
-      </w:pPr>
-      <w:r>
-        <w:rPr>
-          <w:rFonts w:ascii="Arial" w:cs="Arial" w:eastAsia="Arial" w:hAnsi="Arial"/>
-          <w:i/>
-          <w:iCs/>
-          <w:color w:val="AAAAAA"/>
-          <w:sz w:val="22"/>
-          <w:szCs w:val="22"/>
-        </w:rPr>
-        <w:t xml:space="preserve">Type your answer here.</w:t>
-      </w:r>
-    </w:p>
-    <w:p>
-      <w:pPr>
-        <w:spacing w:after="80" w:before="120"/>
-      </w:pPr>
-      <w:r>
-        <w:rPr>
-          <w:rFonts w:ascii="Arial" w:cs="Arial" w:eastAsia="Arial" w:hAnsi="Arial"/>
-          <w:b/>
-          <w:bCs/>
-          <w:color w:val="007474"/>
-          <w:sz w:val="24"/>
-          <w:szCs w:val="24"/>
-        </w:rPr>
-        <w:t xml:space="preserve">2. What did not work, or what was hard?</w:t>
-      </w:r>
-    </w:p>
-    <w:p>
-      <w:pPr>
-        <w:spacing w:after="200"/>
-      </w:pPr>
-      <w:r>
-        <w:rPr>
-          <w:rFonts w:ascii="Arial" w:cs="Arial" w:eastAsia="Arial" w:hAnsi="Arial"/>
-          <w:i/>
-          <w:iCs/>
-          <w:color w:val="AAAAAA"/>
-          <w:sz w:val="22"/>
-          <w:szCs w:val="22"/>
-        </w:rPr>
-        <w:t xml:space="preserve">Type your answer here.</w:t>
-      </w:r>
-    </w:p>
-    <w:p>
-      <w:pPr>
-        <w:spacing w:after="80" w:before="120"/>
-      </w:pPr>
-      <w:r>
-        <w:rPr>
-          <w:rFonts w:ascii="Arial" w:cs="Arial" w:eastAsia="Arial" w:hAnsi="Arial"/>
-          <w:b/>
-          <w:bCs/>
-          <w:color w:val="007474"/>
-          <w:sz w:val="24"/>
-          <w:szCs w:val="24"/>
-        </w:rPr>
-        <w:t xml:space="preserve">3. What would you do better next time?</w:t>
-      </w:r>
-    </w:p>
-    <w:p>
-      <w:pPr>
-        <w:spacing w:after="200"/>
-      </w:pPr>
-      <w:r>
-        <w:rPr>
-          <w:rFonts w:ascii="Arial" w:cs="Arial" w:eastAsia="Arial" w:hAnsi="Arial"/>
-          <w:i/>
-          <w:iCs/>
-          <w:color w:val="AAAAAA"/>
-          <w:sz w:val="22"/>
-          <w:szCs w:val="22"/>
-        </w:rPr>
-        <w:t xml:space="preserve">Type your answer here.</w:t>
-      </w:r>
-    </w:p>
-    <w:p>
-      <w:pPr>
-        <w:spacing w:after="80" w:before="120"/>
-      </w:pPr>
-      <w:r>
-        <w:rPr>
-          <w:rFonts w:ascii="Arial" w:cs="Arial" w:eastAsia="Arial" w:hAnsi="Arial"/>
-          <w:b/>
-          <w:bCs/>
-          <w:color w:val="007474"/>
-          <w:sz w:val="24"/>
-          <w:szCs w:val="24"/>
-        </w:rPr>
-        <w:t xml:space="preserve">4. Share any feedback or an idea for another outdoor photography activity we could try as a class.</w:t>
-      </w:r>
-    </w:p>
-    <w:p>
-      <w:pPr>
-        <w:spacing w:after="200"/>
-      </w:pPr>
-      <w:r>
-        <w:rPr>
-          <w:rFonts w:ascii="Arial" w:cs="Arial" w:eastAsia="Arial" w:hAnsi="Arial"/>
-          <w:i/>
-          <w:iCs/>
-          <w:color w:val="AAAAAA"/>
-          <w:sz w:val="22"/>
-          <w:szCs w:val="22"/>
-        </w:rPr>
-        <w:t xml:space="preserve">Type your answer here.</w:t>
+        <w:t xml:space="preserve">Take your time and answer in full sentences.</w:t>
+      </w:r>
+    </w:p>
+    <w:tbl>
+      <w:tblPr>
+        <w:tblW w:type="dxa" w:w="10800"/>
+        <w:tblBorders>
+          <w:top w:val="none"/>
+          <w:left w:val="none"/>
+          <w:bottom w:val="none"/>
+          <w:right w:val="none"/>
+          <w:insideH w:val="single" w:color="auto" w:sz="4"/>
+          <w:insideV w:val="single" w:color="auto" w:sz="4"/>
+        </w:tblBorders>
+      </w:tblPr>
+      <w:tblGrid>
+        <w:gridCol w:w="10800"/>
+      </w:tblGrid>
+      <w:tr>
+        <w:tc>
+          <w:tcPr>
+            <w:tcW w:type="dxa" w:w="10800"/>
+            <w:shd w:fill="007474" w:val="clear"/>
+            <w:tcMar>
+              <w:top w:type="dxa" w:w="70"/>
+              <w:left w:type="dxa" w:w="160"/>
+              <w:bottom w:type="dxa" w:w="70"/>
+              <w:right w:type="dxa" w:w="160"/>
+            </w:tcMar>
+          </w:tcPr>
+          <w:p>
+            <w:r>
+              <w:rPr>
+                <w:rFonts w:ascii="Arial" w:cs="Arial" w:eastAsia="Arial" w:hAnsi="Arial"/>
+                <w:b/>
+                <w:bCs/>
+                <w:color w:val="FFFFFF"/>
+                <w:sz w:val="23"/>
+                <w:szCs w:val="23"/>
+              </w:rPr>
+              <w:t xml:space="preserve">1.  </w:t>
+            </w:r>
+            <w:r>
+              <w:rPr>
+                <w:rFonts w:ascii="Arial" w:cs="Arial" w:eastAsia="Arial" w:hAnsi="Arial"/>
+                <w:b/>
+                <w:bCs/>
+                <w:color w:val="FFFFFF"/>
+                <w:sz w:val="23"/>
+                <w:szCs w:val="23"/>
+              </w:rPr>
+              <w:t xml:space="preserve">What worked well during the balloon pop?</w:t>
+            </w:r>
+          </w:p>
+        </w:tc>
+      </w:tr>
+    </w:tbl>
+    <w:p>
+      <w:pPr>
+        <w:spacing w:after="60"/>
+      </w:pPr>
+      <w:r>
+        <w:t xml:space="preserve"/>
+      </w:r>
+    </w:p>
+    <w:tbl>
+      <w:tblPr>
+        <w:tblW w:type="dxa" w:w="10800"/>
+        <w:tblBorders>
+          <w:top w:val="single" w:color="auto" w:sz="4"/>
+          <w:left w:val="single" w:color="auto" w:sz="4"/>
+          <w:bottom w:val="single" w:color="auto" w:sz="4"/>
+          <w:right w:val="single" w:color="auto" w:sz="4"/>
+          <w:insideH w:val="single" w:color="auto" w:sz="4"/>
+          <w:insideV w:val="single" w:color="auto" w:sz="4"/>
+        </w:tblBorders>
+      </w:tblPr>
+      <w:tblGrid>
+        <w:gridCol w:w="10800"/>
+      </w:tblGrid>
+      <w:tr>
+        <w:trPr>
+          <w:trHeight w:val="1500" w:hRule="atLeast"/>
+        </w:trPr>
+        <w:tc>
+          <w:tcPr>
+            <w:tcW w:type="dxa" w:w="10800"/>
+            <w:tcBorders>
+              <w:top w:val="single" w:color="C4C4C4" w:sz="8"/>
+              <w:left w:val="single" w:color="C4C4C4" w:sz="8"/>
+              <w:bottom w:val="single" w:color="C4C4C4" w:sz="8"/>
+              <w:right w:val="single" w:color="C4C4C4" w:sz="8"/>
+            </w:tcBorders>
+            <w:tcMar>
+              <w:top w:type="dxa" w:w="100"/>
+              <w:left w:type="dxa" w:w="160"/>
+              <w:bottom w:type="dxa" w:w="100"/>
+              <w:right w:type="dxa" w:w="160"/>
+            </w:tcMar>
+          </w:tcPr>
+          <w:p>
+            <w:r>
+              <w:rPr>
+                <w:i/>
+                <w:iCs/>
+                <w:color w:val="8A8A8A"/>
+                <w:sz w:val="22"/>
+                <w:szCs w:val="22"/>
+              </w:rPr>
+              <w:t xml:space="preserve">Type your answer here.</w:t>
+            </w:r>
+          </w:p>
+        </w:tc>
+      </w:tr>
+    </w:tbl>
+    <w:p>
+      <w:pPr>
+        <w:spacing w:after="160"/>
+      </w:pPr>
+      <w:r>
+        <w:t xml:space="preserve"/>
+      </w:r>
+    </w:p>
+    <w:tbl>
+      <w:tblPr>
+        <w:tblW w:type="dxa" w:w="10800"/>
+        <w:tblBorders>
+          <w:top w:val="none"/>
+          <w:left w:val="none"/>
+          <w:bottom w:val="none"/>
+          <w:right w:val="none"/>
+          <w:insideH w:val="single" w:color="auto" w:sz="4"/>
+          <w:insideV w:val="single" w:color="auto" w:sz="4"/>
+        </w:tblBorders>
+      </w:tblPr>
+      <w:tblGrid>
+        <w:gridCol w:w="10800"/>
+      </w:tblGrid>
+      <w:tr>
+        <w:tc>
+          <w:tcPr>
+            <w:tcW w:type="dxa" w:w="10800"/>
+            <w:shd w:fill="007474" w:val="clear"/>
+            <w:tcMar>
+              <w:top w:type="dxa" w:w="70"/>
+              <w:left w:type="dxa" w:w="160"/>
+              <w:bottom w:type="dxa" w:w="70"/>
+              <w:right w:type="dxa" w:w="160"/>
+            </w:tcMar>
+          </w:tcPr>
+          <w:p>
+            <w:r>
+              <w:rPr>
+                <w:rFonts w:ascii="Arial" w:cs="Arial" w:eastAsia="Arial" w:hAnsi="Arial"/>
+                <w:b/>
+                <w:bCs/>
+                <w:color w:val="FFFFFF"/>
+                <w:sz w:val="23"/>
+                <w:szCs w:val="23"/>
+              </w:rPr>
+              <w:t xml:space="preserve">2.  </w:t>
+            </w:r>
+            <w:r>
+              <w:rPr>
+                <w:rFonts w:ascii="Arial" w:cs="Arial" w:eastAsia="Arial" w:hAnsi="Arial"/>
+                <w:b/>
+                <w:bCs/>
+                <w:color w:val="FFFFFF"/>
+                <w:sz w:val="23"/>
+                <w:szCs w:val="23"/>
+              </w:rPr>
+              <w:t xml:space="preserve">What did not work, or what was hard?</w:t>
+            </w:r>
+          </w:p>
+        </w:tc>
+      </w:tr>
+    </w:tbl>
+    <w:p>
+      <w:pPr>
+        <w:spacing w:after="60"/>
+      </w:pPr>
+      <w:r>
+        <w:t xml:space="preserve"/>
+      </w:r>
+    </w:p>
+    <w:tbl>
+      <w:tblPr>
+        <w:tblW w:type="dxa" w:w="10800"/>
+        <w:tblBorders>
+          <w:top w:val="single" w:color="auto" w:sz="4"/>
+          <w:left w:val="single" w:color="auto" w:sz="4"/>
+          <w:bottom w:val="single" w:color="auto" w:sz="4"/>
+          <w:right w:val="single" w:color="auto" w:sz="4"/>
+          <w:insideH w:val="single" w:color="auto" w:sz="4"/>
+          <w:insideV w:val="single" w:color="auto" w:sz="4"/>
+        </w:tblBorders>
+      </w:tblPr>
+      <w:tblGrid>
+        <w:gridCol w:w="10800"/>
+      </w:tblGrid>
+      <w:tr>
+        <w:trPr>
+          <w:trHeight w:val="1500" w:hRule="atLeast"/>
+        </w:trPr>
+        <w:tc>
+          <w:tcPr>
+            <w:tcW w:type="dxa" w:w="10800"/>
+            <w:tcBorders>
+              <w:top w:val="single" w:color="C4C4C4" w:sz="8"/>
+              <w:left w:val="single" w:color="C4C4C4" w:sz="8"/>
+              <w:bottom w:val="single" w:color="C4C4C4" w:sz="8"/>
+              <w:right w:val="single" w:color="C4C4C4" w:sz="8"/>
+            </w:tcBorders>
+            <w:tcMar>
+              <w:top w:type="dxa" w:w="100"/>
+              <w:left w:type="dxa" w:w="160"/>
+              <w:bottom w:type="dxa" w:w="100"/>
+              <w:right w:type="dxa" w:w="160"/>
+            </w:tcMar>
+          </w:tcPr>
+          <w:p>
+            <w:r>
+              <w:rPr>
+                <w:i/>
+                <w:iCs/>
+                <w:color w:val="8A8A8A"/>
+                <w:sz w:val="22"/>
+                <w:szCs w:val="22"/>
+              </w:rPr>
+              <w:t xml:space="preserve">Type your answer here.</w:t>
+            </w:r>
+          </w:p>
+        </w:tc>
+      </w:tr>
+    </w:tbl>
+    <w:p>
+      <w:pPr>
+        <w:spacing w:after="160"/>
+      </w:pPr>
+      <w:r>
+        <w:t xml:space="preserve"/>
+      </w:r>
+    </w:p>
+    <w:tbl>
+      <w:tblPr>
+        <w:tblW w:type="dxa" w:w="10800"/>
+        <w:tblBorders>
+          <w:top w:val="none"/>
+          <w:left w:val="none"/>
+          <w:bottom w:val="none"/>
+          <w:right w:val="none"/>
+          <w:insideH w:val="single" w:color="auto" w:sz="4"/>
+          <w:insideV w:val="single" w:color="auto" w:sz="4"/>
+        </w:tblBorders>
+      </w:tblPr>
+      <w:tblGrid>
+        <w:gridCol w:w="10800"/>
+      </w:tblGrid>
+      <w:tr>
+        <w:tc>
+          <w:tcPr>
+            <w:tcW w:type="dxa" w:w="10800"/>
+            <w:shd w:fill="007474" w:val="clear"/>
+            <w:tcMar>
+              <w:top w:type="dxa" w:w="70"/>
+              <w:left w:type="dxa" w:w="160"/>
+              <w:bottom w:type="dxa" w:w="70"/>
+              <w:right w:type="dxa" w:w="160"/>
+            </w:tcMar>
+          </w:tcPr>
+          <w:p>
+            <w:r>
+              <w:rPr>
+                <w:rFonts w:ascii="Arial" w:cs="Arial" w:eastAsia="Arial" w:hAnsi="Arial"/>
+                <w:b/>
+                <w:bCs/>
+                <w:color w:val="FFFFFF"/>
+                <w:sz w:val="23"/>
+                <w:szCs w:val="23"/>
+              </w:rPr>
+              <w:t xml:space="preserve">3.  </w:t>
+            </w:r>
+            <w:r>
+              <w:rPr>
+                <w:rFonts w:ascii="Arial" w:cs="Arial" w:eastAsia="Arial" w:hAnsi="Arial"/>
+                <w:b/>
+                <w:bCs/>
+                <w:color w:val="FFFFFF"/>
+                <w:sz w:val="23"/>
+                <w:szCs w:val="23"/>
+              </w:rPr>
+              <w:t xml:space="preserve">What would you do better next time?</w:t>
+            </w:r>
+          </w:p>
+        </w:tc>
+      </w:tr>
+    </w:tbl>
+    <w:p>
+      <w:pPr>
+        <w:spacing w:after="60"/>
+      </w:pPr>
+      <w:r>
+        <w:t xml:space="preserve"/>
+      </w:r>
+    </w:p>
+    <w:tbl>
+      <w:tblPr>
+        <w:tblW w:type="dxa" w:w="10800"/>
+        <w:tblBorders>
+          <w:top w:val="single" w:color="auto" w:sz="4"/>
+          <w:left w:val="single" w:color="auto" w:sz="4"/>
+          <w:bottom w:val="single" w:color="auto" w:sz="4"/>
+          <w:right w:val="single" w:color="auto" w:sz="4"/>
+          <w:insideH w:val="single" w:color="auto" w:sz="4"/>
+          <w:insideV w:val="single" w:color="auto" w:sz="4"/>
+        </w:tblBorders>
+      </w:tblPr>
+      <w:tblGrid>
+        <w:gridCol w:w="10800"/>
+      </w:tblGrid>
+      <w:tr>
+        <w:trPr>
+          <w:trHeight w:val="1500" w:hRule="atLeast"/>
+        </w:trPr>
+        <w:tc>
+          <w:tcPr>
+            <w:tcW w:type="dxa" w:w="10800"/>
+            <w:tcBorders>
+              <w:top w:val="single" w:color="C4C4C4" w:sz="8"/>
+              <w:left w:val="single" w:color="C4C4C4" w:sz="8"/>
+              <w:bottom w:val="single" w:color="C4C4C4" w:sz="8"/>
+              <w:right w:val="single" w:color="C4C4C4" w:sz="8"/>
+            </w:tcBorders>
+            <w:tcMar>
+              <w:top w:type="dxa" w:w="100"/>
+              <w:left w:type="dxa" w:w="160"/>
+              <w:bottom w:type="dxa" w:w="100"/>
+              <w:right w:type="dxa" w:w="160"/>
+            </w:tcMar>
+          </w:tcPr>
+          <w:p>
+            <w:r>
+              <w:rPr>
+                <w:i/>
+                <w:iCs/>
+                <w:color w:val="8A8A8A"/>
+                <w:sz w:val="22"/>
+                <w:szCs w:val="22"/>
+              </w:rPr>
+              <w:t xml:space="preserve">Type your answer here.</w:t>
+            </w:r>
+          </w:p>
+        </w:tc>
+      </w:tr>
+    </w:tbl>
+    <w:p>
+      <w:pPr>
+        <w:spacing w:after="160"/>
+      </w:pPr>
+      <w:r>
+        <w:t xml:space="preserve"/>
+      </w:r>
+    </w:p>
+    <w:tbl>
+      <w:tblPr>
+        <w:tblW w:type="dxa" w:w="10800"/>
+        <w:tblBorders>
+          <w:top w:val="none"/>
+          <w:left w:val="none"/>
+          <w:bottom w:val="none"/>
+          <w:right w:val="none"/>
+          <w:insideH w:val="single" w:color="auto" w:sz="4"/>
+          <w:insideV w:val="single" w:color="auto" w:sz="4"/>
+        </w:tblBorders>
+      </w:tblPr>
+      <w:tblGrid>
+        <w:gridCol w:w="10800"/>
+      </w:tblGrid>
+      <w:tr>
+        <w:tc>
+          <w:tcPr>
+            <w:tcW w:type="dxa" w:w="10800"/>
+            <w:shd w:fill="007474" w:val="clear"/>
+            <w:tcMar>
+              <w:top w:type="dxa" w:w="70"/>
+              <w:left w:type="dxa" w:w="160"/>
+              <w:bottom w:type="dxa" w:w="70"/>
+              <w:right w:type="dxa" w:w="160"/>
+            </w:tcMar>
+          </w:tcPr>
+          <w:p>
+            <w:r>
+              <w:rPr>
+                <w:rFonts w:ascii="Arial" w:cs="Arial" w:eastAsia="Arial" w:hAnsi="Arial"/>
+                <w:b/>
+                <w:bCs/>
+                <w:color w:val="FFFFFF"/>
+                <w:sz w:val="23"/>
+                <w:szCs w:val="23"/>
+              </w:rPr>
+              <w:t xml:space="preserve">4.  </w:t>
+            </w:r>
+            <w:r>
+              <w:rPr>
+                <w:rFonts w:ascii="Arial" w:cs="Arial" w:eastAsia="Arial" w:hAnsi="Arial"/>
+                <w:b/>
+                <w:bCs/>
+                <w:color w:val="FFFFFF"/>
+                <w:sz w:val="23"/>
+                <w:szCs w:val="23"/>
+              </w:rPr>
+              <w:t xml:space="preserve">Share any feedback or an idea for another outdoor photography activity we could try as a class.</w:t>
+            </w:r>
+          </w:p>
+        </w:tc>
+      </w:tr>
+    </w:tbl>
+    <w:p>
+      <w:pPr>
+        <w:spacing w:after="60"/>
+      </w:pPr>
+      <w:r>
+        <w:t xml:space="preserve"/>
+      </w:r>
+    </w:p>
+    <w:tbl>
+      <w:tblPr>
+        <w:tblW w:type="dxa" w:w="10800"/>
+        <w:tblBorders>
+          <w:top w:val="single" w:color="auto" w:sz="4"/>
+          <w:left w:val="single" w:color="auto" w:sz="4"/>
+          <w:bottom w:val="single" w:color="auto" w:sz="4"/>
+          <w:right w:val="single" w:color="auto" w:sz="4"/>
+          <w:insideH w:val="single" w:color="auto" w:sz="4"/>
+          <w:insideV w:val="single" w:color="auto" w:sz="4"/>
+        </w:tblBorders>
+      </w:tblPr>
+      <w:tblGrid>
+        <w:gridCol w:w="10800"/>
+      </w:tblGrid>
+      <w:tr>
+        <w:trPr>
+          <w:trHeight w:val="1500" w:hRule="atLeast"/>
+        </w:trPr>
+        <w:tc>
+          <w:tcPr>
+            <w:tcW w:type="dxa" w:w="10800"/>
+            <w:tcBorders>
+              <w:top w:val="single" w:color="C4C4C4" w:sz="8"/>
+              <w:left w:val="single" w:color="C4C4C4" w:sz="8"/>
+              <w:bottom w:val="single" w:color="C4C4C4" w:sz="8"/>
+              <w:right w:val="single" w:color="C4C4C4" w:sz="8"/>
+            </w:tcBorders>
+            <w:tcMar>
+              <w:top w:type="dxa" w:w="100"/>
+              <w:left w:type="dxa" w:w="160"/>
+              <w:bottom w:type="dxa" w:w="100"/>
+              <w:right w:type="dxa" w:w="160"/>
+            </w:tcMar>
+          </w:tcPr>
+          <w:p>
+            <w:r>
+              <w:rPr>
+                <w:i/>
+                <w:iCs/>
+                <w:color w:val="8A8A8A"/>
+                <w:sz w:val="22"/>
+                <w:szCs w:val="22"/>
+              </w:rPr>
+              <w:t xml:space="preserve">Type your answer here.</w:t>
+            </w:r>
+          </w:p>
+        </w:tc>
+      </w:tr>
+    </w:tbl>
+    <w:p>
+      <w:pPr>
+        <w:spacing w:after="160"/>
+      </w:pPr>
+      <w:r>
+        <w:t xml:space="preserve"/>
       </w:r>
     </w:p>
     <w:sectPr>
       <w:pgSz w:w="12240" w:h="15840" w:orient="portrait"/>
-      <w:pgMar w:top="1440" w:right="1440" w:bottom="1440" w:left="1440" w:header="708" w:footer="708" w:gutter="0"/>
+      <w:pgMar w:top="900" w:right="720" w:bottom="900" w:left="720" w:header="708" w:footer="708" w:gutter="0"/>
       <w:pgNumType/>
       <w:docGrid w:linePitch="360"/>
     </w:sectPr>
@@ -375,7 +824,14 @@
 <file path=word/styles.xml><?xml version="1.0" encoding="utf-8"?>
 <w:styles xmlns:mc="http://schemas.openxmlformats.org/markup-compatibility/2006" xmlns:r="http://schemas.openxmlformats.org/officeDocument/2006/relationships" xmlns:w="http://schemas.openxmlformats.org/wordprocessingml/2006/main" xmlns:w14="http://schemas.microsoft.com/office/word/2010/wordml" xmlns:w15="http://schemas.microsoft.com/office/word/2012/wordml" mc:Ignorable="w14 w15">
   <w:docDefaults>
-    <w:rPrDefault/>
+    <w:rPrDefault>
+      <w:rPr>
+        <w:rFonts w:ascii="Arial" w:cs="Arial" w:eastAsia="Arial" w:hAnsi="Arial"/>
+        <w:color w:val="1A1A1A"/>
+        <w:sz w:val="22"/>
+        <w:szCs w:val="22"/>
+      </w:rPr>
+    </w:rPrDefault>
     <w:pPrDefault/>
   </w:docDefaults>
   <w:style w:type="paragraph" w:styleId="Title">

</xml_diff>